<commit_message>
Updated app for high res figure downloads
</commit_message>
<xml_diff>
--- a/Results/Reg_Table_2.docx
+++ b/Results/Reg_Table_2.docx
@@ -13,12 +13,12 @@
         <w:gridCol w:w="1748"/>
         <w:gridCol w:w="1871"/>
         <w:gridCol w:w="1871"/>
-        <w:gridCol w:w="3154"/>
+        <w:gridCol w:w="1871"/>
         <w:gridCol w:w="1871"/>
       </w:tblGrid>
       <w:tr>
         <w:trPr>
-          <w:trHeight w:val="668" w:hRule="auto"/>
+          <w:trHeight w:val="625" w:hRule="auto"/>
         </w:trPr>
         body 1
         <w:tc>
@@ -123,7 +123,7 @@
                 <w:szCs w:val="22"/>
                 <w:color w:val="000000"/>
               </w:rPr>
-              <w:t xml:space="preserve">Foreign-born</w:t>
+              <w:t xml:space="preserve">Model 1</w:t>
             </w:r>
           </w:p>
         </w:tc>
@@ -176,7 +176,7 @@
                 <w:szCs w:val="22"/>
                 <w:color w:val="000000"/>
               </w:rPr>
-              <w:t xml:space="preserve">Native-born</w:t>
+              <w:t xml:space="preserve">Model 2</w:t>
             </w:r>
           </w:p>
         </w:tc>
@@ -229,7 +229,7 @@
                 <w:szCs w:val="22"/>
                 <w:color w:val="000000"/>
               </w:rPr>
-              <w:t xml:space="preserve">Pooled</w:t>
+              <w:t xml:space="preserve">Model 3</w:t>
             </w:r>
           </w:p>
         </w:tc>
@@ -282,7 +282,7 @@
                 <w:szCs w:val="22"/>
                 <w:color w:val="000000"/>
               </w:rPr>
-              <w:t xml:space="preserve">Pooled with ALE interaction</w:t>
+              <w:t xml:space="preserve">Model 4</w:t>
             </w:r>
           </w:p>
         </w:tc>
@@ -335,7 +335,7 @@
                 <w:szCs w:val="22"/>
                 <w:color w:val="000000"/>
               </w:rPr>
-              <w:t xml:space="preserve">NA</w:t>
+              <w:t xml:space="preserve">Model 5</w:t>
             </w:r>
           </w:p>
         </w:tc>

</xml_diff>